<commit_message>
Add dataset class, transformations and dataloaders
</commit_message>
<xml_diff>
--- a/Documentation/Project Documentation.docx
+++ b/Documentation/Project Documentation.docx
@@ -26,47 +26,7 @@
     </w:p>
     <w:p>
       <w:r>
-        <w:t xml:space="preserve">[Abhi </w:t>
-      </w:r>
-      <w:proofErr w:type="spellStart"/>
-      <w:r>
-        <w:t>khali</w:t>
-      </w:r>
-      <w:proofErr w:type="spellEnd"/>
-      <w:r>
-        <w:t xml:space="preserve"> </w:t>
-      </w:r>
-      <w:proofErr w:type="spellStart"/>
-      <w:r>
-        <w:t>chhodo</w:t>
-      </w:r>
-      <w:proofErr w:type="spellEnd"/>
-      <w:r>
-        <w:t xml:space="preserve"> - </w:t>
-      </w:r>
-      <w:proofErr w:type="spellStart"/>
-      <w:r>
-        <w:t>baad</w:t>
-      </w:r>
-      <w:proofErr w:type="spellEnd"/>
-      <w:r>
-        <w:t xml:space="preserve"> </w:t>
-      </w:r>
-      <w:proofErr w:type="spellStart"/>
-      <w:r>
-        <w:t>mein</w:t>
-      </w:r>
-      <w:proofErr w:type="spellEnd"/>
-      <w:r>
-        <w:t xml:space="preserve"> </w:t>
-      </w:r>
-      <w:proofErr w:type="spellStart"/>
-      <w:r>
-        <w:t>bharenge</w:t>
-      </w:r>
-      <w:proofErr w:type="spellEnd"/>
-      <w:r>
-        <w:t>]</w:t>
+        <w:t>[Abhi khali chhodo - baad mein bharenge]</w:t>
       </w:r>
     </w:p>
     <w:p/>
@@ -83,23 +43,7 @@
     </w:p>
     <w:p>
       <w:r>
-        <w:t xml:space="preserve">[Abhi </w:t>
-      </w:r>
-      <w:proofErr w:type="spellStart"/>
-      <w:r>
-        <w:t>khali</w:t>
-      </w:r>
-      <w:proofErr w:type="spellEnd"/>
-      <w:r>
-        <w:t xml:space="preserve"> </w:t>
-      </w:r>
-      <w:proofErr w:type="spellStart"/>
-      <w:r>
-        <w:t>chhodo</w:t>
-      </w:r>
-      <w:proofErr w:type="spellEnd"/>
-      <w:r>
-        <w:t>]</w:t>
+        <w:t>[Abhi khali chhodo]</w:t>
       </w:r>
     </w:p>
     <w:p/>
@@ -116,23 +60,7 @@
     </w:p>
     <w:p>
       <w:r>
-        <w:t xml:space="preserve">[Abhi </w:t>
-      </w:r>
-      <w:proofErr w:type="spellStart"/>
-      <w:r>
-        <w:t>khali</w:t>
-      </w:r>
-      <w:proofErr w:type="spellEnd"/>
-      <w:r>
-        <w:t xml:space="preserve"> </w:t>
-      </w:r>
-      <w:proofErr w:type="spellStart"/>
-      <w:r>
-        <w:t>chhodo</w:t>
-      </w:r>
-      <w:proofErr w:type="spellEnd"/>
-      <w:r>
-        <w:t>]</w:t>
+        <w:t>[Abhi khali chhodo]</w:t>
       </w:r>
     </w:p>
     <w:p/>
@@ -149,23 +77,7 @@
     </w:p>
     <w:p>
       <w:r>
-        <w:t xml:space="preserve">[Abhi </w:t>
-      </w:r>
-      <w:proofErr w:type="spellStart"/>
-      <w:r>
-        <w:t>khali</w:t>
-      </w:r>
-      <w:proofErr w:type="spellEnd"/>
-      <w:r>
-        <w:t xml:space="preserve"> </w:t>
-      </w:r>
-      <w:proofErr w:type="spellStart"/>
-      <w:r>
-        <w:t>chhodo</w:t>
-      </w:r>
-      <w:proofErr w:type="spellEnd"/>
-      <w:r>
-        <w:t>]</w:t>
+        <w:t>[Abhi khali chhodo]</w:t>
       </w:r>
     </w:p>
     <w:p/>
@@ -182,23 +94,7 @@
     </w:p>
     <w:p>
       <w:r>
-        <w:t xml:space="preserve">[Abhi </w:t>
-      </w:r>
-      <w:proofErr w:type="spellStart"/>
-      <w:r>
-        <w:t>khali</w:t>
-      </w:r>
-      <w:proofErr w:type="spellEnd"/>
-      <w:r>
-        <w:t xml:space="preserve"> </w:t>
-      </w:r>
-      <w:proofErr w:type="spellStart"/>
-      <w:r>
-        <w:t>chhodo</w:t>
-      </w:r>
-      <w:proofErr w:type="spellEnd"/>
-      <w:r>
-        <w:t>]</w:t>
+        <w:t>[Abhi khali chhodo]</w:t>
       </w:r>
     </w:p>
     <w:p/>
@@ -207,37 +103,67 @@
         <w:t>==================================================</w:t>
       </w:r>
     </w:p>
+    <w:p>
+      <w:r>
+        <w:t>6. TECH STACK</w:t>
+      </w:r>
+    </w:p>
     <w:p/>
     <w:p>
       <w:r>
-        <w:t>6. TECH STACK</w:t>
-      </w:r>
-    </w:p>
-    <w:p>
-      <w:r>
-        <w:t xml:space="preserve">[Abhi </w:t>
-      </w:r>
-      <w:proofErr w:type="spellStart"/>
-      <w:r>
-        <w:t>khali</w:t>
-      </w:r>
-      <w:proofErr w:type="spellEnd"/>
-      <w:r>
-        <w:t xml:space="preserve"> </w:t>
-      </w:r>
-      <w:proofErr w:type="spellStart"/>
-      <w:r>
-        <w:t>chhodo</w:t>
-      </w:r>
-      <w:proofErr w:type="spellEnd"/>
-      <w:r>
-        <w:t>]</w:t>
+        <w:t>Programming Language: Python 3.14</w:t>
+      </w:r>
+    </w:p>
+    <w:p>
+      <w:r>
+        <w:t>Deep Learning Framework: PyTorch 2.9.1</w:t>
+      </w:r>
+    </w:p>
+    <w:p>
+      <w:r>
+        <w:t xml:space="preserve">Libraries: </w:t>
+      </w:r>
+    </w:p>
+    <w:p>
+      <w:r>
+        <w:t xml:space="preserve">  - NumPy, Pandas (Data handling)</w:t>
+      </w:r>
+    </w:p>
+    <w:p>
+      <w:r>
+        <w:lastRenderedPageBreak/>
+        <w:t xml:space="preserve">  - Matplotlib, Seaborn (Visualization)</w:t>
+      </w:r>
+    </w:p>
+    <w:p>
+      <w:r>
+        <w:t xml:space="preserve">  - PIL (Image processing)</w:t>
+      </w:r>
+    </w:p>
+    <w:p>
+      <w:r>
+        <w:t xml:space="preserve">  - Scikit-learn (Evaluation metrics)</w:t>
       </w:r>
     </w:p>
     <w:p/>
     <w:p>
       <w:r>
-        <w:t>==================================================</w:t>
+        <w:t>Development Environment: Jupyter Notebook</w:t>
+      </w:r>
+    </w:p>
+    <w:p>
+      <w:r>
+        <w:t>Version Control: Git &amp; GitHub</w:t>
+      </w:r>
+    </w:p>
+    <w:p>
+      <w:r>
+        <w:t>Dataset: PlantVillage (54,305 images, 38 classes)</w:t>
+      </w:r>
+    </w:p>
+    <w:p>
+      <w:r>
+        <w:t>Model Architecture: Vision Transformer (ViT)</w:t>
       </w:r>
     </w:p>
     <w:sectPr>

</xml_diff>